<commit_message>
Updated D2 report and added D1 report with matching name convention.
</commit_message>
<xml_diff>
--- a/reports/D2_Parser_Report.docx
+++ b/reports/D2_Parser_Report.docx
@@ -313,12 +313,6 @@
         <w:gridCol w:w="4160"/>
       </w:tblGrid>
       <w:tr>
-        <w:tblPrEx>
-          <w:tblCellMar>
-            <w:top w:w="0" w:type="dxa"/>
-            <w:bottom w:w="0" w:type="dxa"/>
-          </w:tblCellMar>
-        </w:tblPrEx>
         <w:trPr>
           <w:cantSplit/>
           <w:tblHeader/>
@@ -412,12 +406,6 @@
         </w:tc>
       </w:tr>
       <w:tr>
-        <w:tblPrEx>
-          <w:tblCellMar>
-            <w:top w:w="0" w:type="dxa"/>
-            <w:bottom w:w="0" w:type="dxa"/>
-          </w:tblCellMar>
-        </w:tblPrEx>
         <w:trPr>
           <w:cantSplit/>
         </w:trPr>
@@ -517,12 +505,6 @@
         </w:tc>
       </w:tr>
       <w:tr>
-        <w:tblPrEx>
-          <w:tblCellMar>
-            <w:top w:w="0" w:type="dxa"/>
-            <w:bottom w:w="0" w:type="dxa"/>
-          </w:tblCellMar>
-        </w:tblPrEx>
         <w:trPr>
           <w:cantSplit/>
         </w:trPr>
@@ -804,12 +786,6 @@
         <w:gridCol w:w="6760"/>
       </w:tblGrid>
       <w:tr>
-        <w:tblPrEx>
-          <w:tblCellMar>
-            <w:top w:w="0" w:type="dxa"/>
-            <w:bottom w:w="0" w:type="dxa"/>
-          </w:tblCellMar>
-        </w:tblPrEx>
         <w:trPr>
           <w:cantSplit/>
           <w:tblHeader/>
@@ -874,12 +850,6 @@
         </w:tc>
       </w:tr>
       <w:tr>
-        <w:tblPrEx>
-          <w:tblCellMar>
-            <w:top w:w="0" w:type="dxa"/>
-            <w:bottom w:w="0" w:type="dxa"/>
-          </w:tblCellMar>
-        </w:tblPrEx>
         <w:trPr>
           <w:cantSplit/>
         </w:trPr>
@@ -955,12 +925,6 @@
         </w:tc>
       </w:tr>
       <w:tr>
-        <w:tblPrEx>
-          <w:tblCellMar>
-            <w:top w:w="0" w:type="dxa"/>
-            <w:bottom w:w="0" w:type="dxa"/>
-          </w:tblCellMar>
-        </w:tblPrEx>
         <w:trPr>
           <w:cantSplit/>
         </w:trPr>
@@ -1028,12 +992,6 @@
         </w:tc>
       </w:tr>
       <w:tr>
-        <w:tblPrEx>
-          <w:tblCellMar>
-            <w:top w:w="0" w:type="dxa"/>
-            <w:bottom w:w="0" w:type="dxa"/>
-          </w:tblCellMar>
-        </w:tblPrEx>
         <w:trPr>
           <w:cantSplit/>
         </w:trPr>
@@ -2936,12 +2894,6 @@
         <w:gridCol w:w="5760"/>
       </w:tblGrid>
       <w:tr>
-        <w:tblPrEx>
-          <w:tblCellMar>
-            <w:top w:w="0" w:type="dxa"/>
-            <w:bottom w:w="0" w:type="dxa"/>
-          </w:tblCellMar>
-        </w:tblPrEx>
         <w:trPr>
           <w:cantSplit/>
           <w:tblHeader/>
@@ -3035,12 +2987,6 @@
         </w:tc>
       </w:tr>
       <w:tr>
-        <w:tblPrEx>
-          <w:tblCellMar>
-            <w:top w:w="0" w:type="dxa"/>
-            <w:bottom w:w="0" w:type="dxa"/>
-          </w:tblCellMar>
-        </w:tblPrEx>
         <w:trPr>
           <w:cantSplit/>
         </w:trPr>
@@ -3126,12 +3072,6 @@
         </w:tc>
       </w:tr>
       <w:tr>
-        <w:tblPrEx>
-          <w:tblCellMar>
-            <w:top w:w="0" w:type="dxa"/>
-            <w:bottom w:w="0" w:type="dxa"/>
-          </w:tblCellMar>
-        </w:tblPrEx>
         <w:trPr>
           <w:cantSplit/>
         </w:trPr>
@@ -3217,12 +3157,6 @@
         </w:tc>
       </w:tr>
       <w:tr>
-        <w:tblPrEx>
-          <w:tblCellMar>
-            <w:top w:w="0" w:type="dxa"/>
-            <w:bottom w:w="0" w:type="dxa"/>
-          </w:tblCellMar>
-        </w:tblPrEx>
         <w:trPr>
           <w:cantSplit/>
         </w:trPr>
@@ -3308,12 +3242,6 @@
         </w:tc>
       </w:tr>
       <w:tr>
-        <w:tblPrEx>
-          <w:tblCellMar>
-            <w:top w:w="0" w:type="dxa"/>
-            <w:bottom w:w="0" w:type="dxa"/>
-          </w:tblCellMar>
-        </w:tblPrEx>
         <w:trPr>
           <w:cantSplit/>
         </w:trPr>
@@ -3399,12 +3327,6 @@
         </w:tc>
       </w:tr>
       <w:tr>
-        <w:tblPrEx>
-          <w:tblCellMar>
-            <w:top w:w="0" w:type="dxa"/>
-            <w:bottom w:w="0" w:type="dxa"/>
-          </w:tblCellMar>
-        </w:tblPrEx>
         <w:trPr>
           <w:cantSplit/>
         </w:trPr>
@@ -3490,12 +3412,6 @@
         </w:tc>
       </w:tr>
       <w:tr>
-        <w:tblPrEx>
-          <w:tblCellMar>
-            <w:top w:w="0" w:type="dxa"/>
-            <w:bottom w:w="0" w:type="dxa"/>
-          </w:tblCellMar>
-        </w:tblPrEx>
         <w:trPr>
           <w:cantSplit/>
         </w:trPr>
@@ -3581,12 +3497,6 @@
         </w:tc>
       </w:tr>
       <w:tr>
-        <w:tblPrEx>
-          <w:tblCellMar>
-            <w:top w:w="0" w:type="dxa"/>
-            <w:bottom w:w="0" w:type="dxa"/>
-          </w:tblCellMar>
-        </w:tblPrEx>
         <w:trPr>
           <w:cantSplit/>
         </w:trPr>
@@ -3688,12 +3598,6 @@
         </w:tc>
       </w:tr>
       <w:tr>
-        <w:tblPrEx>
-          <w:tblCellMar>
-            <w:top w:w="0" w:type="dxa"/>
-            <w:bottom w:w="0" w:type="dxa"/>
-          </w:tblCellMar>
-        </w:tblPrEx>
         <w:trPr>
           <w:cantSplit/>
         </w:trPr>
@@ -3779,12 +3683,6 @@
         </w:tc>
       </w:tr>
       <w:tr>
-        <w:tblPrEx>
-          <w:tblCellMar>
-            <w:top w:w="0" w:type="dxa"/>
-            <w:bottom w:w="0" w:type="dxa"/>
-          </w:tblCellMar>
-        </w:tblPrEx>
         <w:trPr>
           <w:cantSplit/>
         </w:trPr>
@@ -3870,12 +3768,6 @@
         </w:tc>
       </w:tr>
       <w:tr>
-        <w:tblPrEx>
-          <w:tblCellMar>
-            <w:top w:w="0" w:type="dxa"/>
-            <w:bottom w:w="0" w:type="dxa"/>
-          </w:tblCellMar>
-        </w:tblPrEx>
         <w:trPr>
           <w:cantSplit/>
         </w:trPr>
@@ -3977,12 +3869,6 @@
         </w:tc>
       </w:tr>
       <w:tr>
-        <w:tblPrEx>
-          <w:tblCellMar>
-            <w:top w:w="0" w:type="dxa"/>
-            <w:bottom w:w="0" w:type="dxa"/>
-          </w:tblCellMar>
-        </w:tblPrEx>
         <w:trPr>
           <w:cantSplit/>
         </w:trPr>
@@ -4084,12 +3970,6 @@
         </w:tc>
       </w:tr>
       <w:tr>
-        <w:tblPrEx>
-          <w:tblCellMar>
-            <w:top w:w="0" w:type="dxa"/>
-            <w:bottom w:w="0" w:type="dxa"/>
-          </w:tblCellMar>
-        </w:tblPrEx>
         <w:trPr>
           <w:cantSplit/>
         </w:trPr>
@@ -4191,12 +4071,6 @@
         </w:tc>
       </w:tr>
       <w:tr>
-        <w:tblPrEx>
-          <w:tblCellMar>
-            <w:top w:w="0" w:type="dxa"/>
-            <w:bottom w:w="0" w:type="dxa"/>
-          </w:tblCellMar>
-        </w:tblPrEx>
         <w:trPr>
           <w:cantSplit/>
         </w:trPr>
@@ -4316,27 +4190,266 @@
     </w:p>
     <w:p>
       <w:pPr>
+        <w:keepNext/>
         <w:spacing w:after="160"/>
       </w:pPr>
       <w:r>
+        <w:lastRenderedPageBreak/>
+        <w:drawing>
+          <wp:inline distT="0" distB="0" distL="0" distR="0" wp14:anchorId="284A3BB5" wp14:editId="42E15DBA">
+            <wp:extent cx="5943600" cy="2563495"/>
+            <wp:effectExtent l="0" t="0" r="0" b="8255"/>
+            <wp:docPr id="1659906830" name="Picture 1"/>
+            <wp:cNvGraphicFramePr>
+              <a:graphicFrameLocks xmlns:a="http://schemas.openxmlformats.org/drawingml/2006/main" noChangeAspect="1"/>
+            </wp:cNvGraphicFramePr>
+            <a:graphic xmlns:a="http://schemas.openxmlformats.org/drawingml/2006/main">
+              <a:graphicData uri="http://schemas.openxmlformats.org/drawingml/2006/picture">
+                <pic:pic xmlns:pic="http://schemas.openxmlformats.org/drawingml/2006/picture">
+                  <pic:nvPicPr>
+                    <pic:cNvPr id="1659906830" name=""/>
+                    <pic:cNvPicPr/>
+                  </pic:nvPicPr>
+                  <pic:blipFill>
+                    <a:blip r:embed="rId7"/>
+                    <a:stretch>
+                      <a:fillRect/>
+                    </a:stretch>
+                  </pic:blipFill>
+                  <pic:spPr>
+                    <a:xfrm>
+                      <a:off x="0" y="0"/>
+                      <a:ext cx="5943600" cy="2563495"/>
+                    </a:xfrm>
+                    <a:prstGeom prst="rect">
+                      <a:avLst/>
+                    </a:prstGeom>
+                  </pic:spPr>
+                </pic:pic>
+              </a:graphicData>
+            </a:graphic>
+          </wp:inline>
+        </w:drawing>
+      </w:r>
+    </w:p>
+    <w:p>
+      <w:pPr>
+        <w:pStyle w:val="Caption"/>
+        <w:jc w:val="center"/>
+      </w:pPr>
+      <w:r>
+        <w:t xml:space="preserve">Figure </w:t>
+      </w:r>
+      <w:r>
+        <w:fldChar w:fldCharType="begin"/>
+      </w:r>
+      <w:r>
+        <w:instrText xml:space="preserve"> SEQ Figure \* ARABIC </w:instrText>
+      </w:r>
+      <w:r>
+        <w:fldChar w:fldCharType="separate"/>
+      </w:r>
+      <w:r>
+        <w:rPr>
+          <w:noProof/>
+        </w:rPr>
+        <w:t>1</w:t>
+      </w:r>
+      <w:r>
+        <w:fldChar w:fldCharType="end"/>
+      </w:r>
+      <w:r>
+        <w:t xml:space="preserve">: </w:t>
+      </w:r>
+      <w:proofErr w:type="spellStart"/>
+      <w:r>
+        <w:t>valid.scl</w:t>
+      </w:r>
+      <w:proofErr w:type="spellEnd"/>
+      <w:r>
+        <w:t xml:space="preserve"> Output</w:t>
+      </w:r>
+    </w:p>
+    <w:p>
+      <w:pPr>
+        <w:keepNext/>
+        <w:spacing w:after="160"/>
+      </w:pPr>
+      <w:r>
         <w:rPr>
           <w:highlight w:val="yellow"/>
         </w:rPr>
-        <w:t xml:space="preserve">[TODO: Figure 1: screenshot of </w:t>
-      </w:r>
-      <w:proofErr w:type="spellStart"/>
-      <w:r>
-        <w:rPr>
-          <w:highlight w:val="yellow"/>
-        </w:rPr>
-        <w:t>valid.scl</w:t>
-      </w:r>
-      <w:proofErr w:type="spellEnd"/>
-      <w:r>
-        <w:rPr>
-          <w:highlight w:val="yellow"/>
-        </w:rPr>
-        <w:t xml:space="preserve"> output (Vlad)]</w:t>
+        <w:t xml:space="preserve"> </w:t>
+      </w:r>
+      <w:r>
+        <w:drawing>
+          <wp:inline distT="0" distB="0" distL="0" distR="0" wp14:anchorId="1457F846" wp14:editId="0A64A185">
+            <wp:extent cx="5943600" cy="1795780"/>
+            <wp:effectExtent l="0" t="0" r="0" b="0"/>
+            <wp:docPr id="1066954258" name="Picture 1"/>
+            <wp:cNvGraphicFramePr>
+              <a:graphicFrameLocks xmlns:a="http://schemas.openxmlformats.org/drawingml/2006/main" noChangeAspect="1"/>
+            </wp:cNvGraphicFramePr>
+            <a:graphic xmlns:a="http://schemas.openxmlformats.org/drawingml/2006/main">
+              <a:graphicData uri="http://schemas.openxmlformats.org/drawingml/2006/picture">
+                <pic:pic xmlns:pic="http://schemas.openxmlformats.org/drawingml/2006/picture">
+                  <pic:nvPicPr>
+                    <pic:cNvPr id="1066954258" name=""/>
+                    <pic:cNvPicPr/>
+                  </pic:nvPicPr>
+                  <pic:blipFill>
+                    <a:blip r:embed="rId8"/>
+                    <a:stretch>
+                      <a:fillRect/>
+                    </a:stretch>
+                  </pic:blipFill>
+                  <pic:spPr>
+                    <a:xfrm>
+                      <a:off x="0" y="0"/>
+                      <a:ext cx="5943600" cy="1795780"/>
+                    </a:xfrm>
+                    <a:prstGeom prst="rect">
+                      <a:avLst/>
+                    </a:prstGeom>
+                  </pic:spPr>
+                </pic:pic>
+              </a:graphicData>
+            </a:graphic>
+          </wp:inline>
+        </w:drawing>
+      </w:r>
+    </w:p>
+    <w:p>
+      <w:pPr>
+        <w:pStyle w:val="Caption"/>
+        <w:jc w:val="center"/>
+      </w:pPr>
+      <w:r>
+        <w:t xml:space="preserve">Figure </w:t>
+      </w:r>
+      <w:r>
+        <w:fldChar w:fldCharType="begin"/>
+      </w:r>
+      <w:r>
+        <w:instrText xml:space="preserve"> SEQ Figure \* ARABIC </w:instrText>
+      </w:r>
+      <w:r>
+        <w:fldChar w:fldCharType="separate"/>
+      </w:r>
+      <w:r>
+        <w:rPr>
+          <w:noProof/>
+        </w:rPr>
+        <w:t>2</w:t>
+      </w:r>
+      <w:r>
+        <w:fldChar w:fldCharType="end"/>
+      </w:r>
+      <w:r>
+        <w:t xml:space="preserve">: </w:t>
+      </w:r>
+      <w:proofErr w:type="spellStart"/>
+      <w:r>
+        <w:t>err_multi.scl</w:t>
+      </w:r>
+      <w:proofErr w:type="spellEnd"/>
+      <w:r>
+        <w:t xml:space="preserve"> Output</w:t>
+      </w:r>
+    </w:p>
+    <w:p>
+      <w:pPr>
+        <w:pStyle w:val="Heading1"/>
+      </w:pPr>
+      <w:r>
+        <w:rPr>
+          <w:b w:val="0"/>
+          <w:bCs w:val="0"/>
+          <w:sz w:val="24"/>
+          <w:szCs w:val="24"/>
+        </w:rPr>
+        <w:lastRenderedPageBreak/>
+        <w:drawing>
+          <wp:inline distT="0" distB="0" distL="0" distR="0" wp14:anchorId="01EE197F" wp14:editId="5D586FEF">
+            <wp:extent cx="5943600" cy="2673350"/>
+            <wp:effectExtent l="0" t="0" r="0" b="0"/>
+            <wp:docPr id="1794784374" name="Picture 1"/>
+            <wp:cNvGraphicFramePr>
+              <a:graphicFrameLocks xmlns:a="http://schemas.openxmlformats.org/drawingml/2006/main" noChangeAspect="1"/>
+            </wp:cNvGraphicFramePr>
+            <a:graphic xmlns:a="http://schemas.openxmlformats.org/drawingml/2006/main">
+              <a:graphicData uri="http://schemas.openxmlformats.org/drawingml/2006/picture">
+                <pic:pic xmlns:pic="http://schemas.openxmlformats.org/drawingml/2006/picture">
+                  <pic:nvPicPr>
+                    <pic:cNvPr id="1794784374" name=""/>
+                    <pic:cNvPicPr/>
+                  </pic:nvPicPr>
+                  <pic:blipFill>
+                    <a:blip r:embed="rId9"/>
+                    <a:stretch>
+                      <a:fillRect/>
+                    </a:stretch>
+                  </pic:blipFill>
+                  <pic:spPr>
+                    <a:xfrm>
+                      <a:off x="0" y="0"/>
+                      <a:ext cx="5943600" cy="2673350"/>
+                    </a:xfrm>
+                    <a:prstGeom prst="rect">
+                      <a:avLst/>
+                    </a:prstGeom>
+                  </pic:spPr>
+                </pic:pic>
+              </a:graphicData>
+            </a:graphic>
+          </wp:inline>
+        </w:drawing>
+      </w:r>
+    </w:p>
+    <w:p>
+      <w:pPr>
+        <w:pStyle w:val="Caption"/>
+        <w:jc w:val="center"/>
+      </w:pPr>
+      <w:r>
+        <w:t xml:space="preserve">Figure </w:t>
+      </w:r>
+      <w:r>
+        <w:fldChar w:fldCharType="begin"/>
+      </w:r>
+      <w:r>
+        <w:instrText xml:space="preserve"> SEQ Figure \* ARABIC </w:instrText>
+      </w:r>
+      <w:r>
+        <w:fldChar w:fldCharType="separate"/>
+      </w:r>
+      <w:r>
+        <w:rPr>
+          <w:noProof/>
+        </w:rPr>
+        <w:t>3</w:t>
+      </w:r>
+      <w:r>
+        <w:fldChar w:fldCharType="end"/>
+      </w:r>
+      <w:r>
+        <w:t xml:space="preserve">: ParserOutput.txt (from </w:t>
+      </w:r>
+      <w:proofErr w:type="spellStart"/>
+      <w:r>
+        <w:t>err_multi.scl</w:t>
+      </w:r>
+      <w:proofErr w:type="spellEnd"/>
+      <w:r>
+        <w:t>)</w:t>
+      </w:r>
+    </w:p>
+    <w:p>
+      <w:pPr>
+        <w:pStyle w:val="Heading1"/>
+      </w:pPr>
+      <w:r>
+        <w:t>Comments and Conclusion</w:t>
       </w:r>
     </w:p>
     <w:p>
@@ -4344,10 +4457,23 @@
         <w:spacing w:after="160"/>
       </w:pPr>
       <w:r>
-        <w:rPr>
-          <w:highlight w:val="yellow"/>
-        </w:rPr>
-        <w:t>[TODO: Figure 2: screenshot of an error file and its messages (Vlad)]</w:t>
+        <w:t xml:space="preserve">The parser meets the objectives of Deliverable 2. It works with the scanner from Deliverable 1, checks a program against the grammar in Appendix D, prints every statement it recognizes, and reports each syntax error with its line number without stopping at the first one. The only change to </w:t>
+      </w:r>
+      <w:proofErr w:type="gramStart"/>
+      <w:r>
+        <w:t>the Deliverable</w:t>
+      </w:r>
+      <w:proofErr w:type="gramEnd"/>
+      <w:r>
+        <w:t xml:space="preserve"> 1 grammar was the addition of the return statement. We chose not to expand the subset, so the string type, parentheses in expressions, and the </w:t>
+      </w:r>
+      <w:proofErr w:type="spellStart"/>
+      <w:r>
+        <w:t>and</w:t>
+      </w:r>
+      <w:proofErr w:type="spellEnd"/>
+      <w:r>
+        <w:t>, or, and not operators are not part of it.</w:t>
       </w:r>
     </w:p>
     <w:p>
@@ -4355,10 +4481,15 @@
         <w:spacing w:after="160"/>
       </w:pPr>
       <w:r>
-        <w:rPr>
-          <w:highlight w:val="yellow"/>
-        </w:rPr>
-        <w:t>[TODO: Figure 3: screenshot of the saved output file (Vlad)]</w:t>
+        <w:t>The parser has some known limitations. When the scanner drops a bad token, such as an unterminated string or a malformed number, the parser can report a follow-on error near it. Recovery only happens inside the declarations and the statement blocks, so an error in the function header, for example an unsupported return type such as double, can produce several follow-on errors. Expressions are returned as text for logging, not as a tree.</w:t>
+      </w:r>
+    </w:p>
+    <w:p>
+      <w:pPr>
+        <w:spacing w:after="160"/>
+      </w:pPr>
+      <w:r>
+        <w:t>For Deliverable 3, the interpreter needs the parser to return an expression tree for each expression so that it can evaluate set, display, if, and return statements. The parser already checks every variable against the declared names, which the interpreter can reuse.</w:t>
       </w:r>
     </w:p>
     <w:p>
@@ -4366,7 +4497,7 @@
         <w:pStyle w:val="Heading1"/>
       </w:pPr>
       <w:r>
-        <w:t>Comments and Conclusion</w:t>
+        <w:t>References</w:t>
       </w:r>
     </w:p>
     <w:p>
@@ -4374,71 +4505,12 @@
         <w:spacing w:after="160"/>
       </w:pPr>
       <w:r>
-        <w:t xml:space="preserve">The parser meets the objectives of Deliverable 2. It works with the scanner from Deliverable 1, checks a program against the grammar in Appendix D, prints every statement it recognizes, and reports each syntax error with its line number without stopping at the first one. The only change to </w:t>
-      </w:r>
-      <w:proofErr w:type="gramStart"/>
-      <w:r>
-        <w:t>the Deliverable</w:t>
-      </w:r>
-      <w:proofErr w:type="gramEnd"/>
-      <w:r>
-        <w:t xml:space="preserve"> 1 grammar was the addition of the return statement. We chose not to expand </w:t>
-      </w:r>
-      <w:r>
-        <w:lastRenderedPageBreak/>
-        <w:t xml:space="preserve">the subset, so the string type, parentheses in expressions, and the </w:t>
-      </w:r>
-      <w:proofErr w:type="spellStart"/>
-      <w:r>
-        <w:t>and</w:t>
-      </w:r>
-      <w:proofErr w:type="spellEnd"/>
-      <w:r>
-        <w:t>, or, and not operators are not part of it.</w:t>
-      </w:r>
-    </w:p>
-    <w:p>
-      <w:pPr>
-        <w:spacing w:after="160"/>
-      </w:pPr>
-      <w:r>
-        <w:t>The parser has some known limitations. When the scanner drops a bad token, such as an unterminated string or a malformed number, the parser can report a follow-on error near it. Recovery only happens inside the declarations and the statement blocks, so an error in the function header, for example an unsupported return type such as double, can produce several follow-on errors. Expressions are returned as text for logging, not as a tree.</w:t>
-      </w:r>
-    </w:p>
-    <w:p>
-      <w:pPr>
-        <w:spacing w:after="160"/>
-      </w:pPr>
-      <w:r>
-        <w:t>For Deliverable 3, the interpreter needs the parser to return an expression tree for each expression so that it can evaluate set, display, if, and return statements. The parser already checks every variable against the declared names, which the interpreter can reuse.</w:t>
-      </w:r>
-    </w:p>
-    <w:p>
-      <w:pPr>
-        <w:pStyle w:val="Heading1"/>
-      </w:pPr>
-      <w:r>
-        <w:t>References</w:t>
-      </w:r>
-    </w:p>
-    <w:p>
-      <w:pPr>
-        <w:spacing w:after="160"/>
-        <w:rPr>
-          <w:highlight w:val="yellow"/>
-        </w:rPr>
-      </w:pPr>
-      <w:r>
-        <w:rPr>
-          <w:highlight w:val="yellow"/>
-        </w:rPr>
         <w:t xml:space="preserve">Garrido, J. M. (2018). </w:t>
       </w:r>
       <w:r>
         <w:rPr>
           <w:i/>
           <w:iCs/>
-          <w:highlight w:val="yellow"/>
         </w:rPr>
         <w:t xml:space="preserve">Grammar of the </w:t>
       </w:r>
@@ -4447,7 +4519,6 @@
         <w:rPr>
           <w:i/>
           <w:iCs/>
-          <w:highlight w:val="yellow"/>
         </w:rPr>
         <w:t>Sysplm</w:t>
       </w:r>
@@ -4456,51 +4527,79 @@
         <w:rPr>
           <w:i/>
           <w:iCs/>
-          <w:highlight w:val="yellow"/>
         </w:rPr>
         <w:t xml:space="preserve"> system programming language</w:t>
       </w:r>
       <w:r>
-        <w:rPr>
-          <w:highlight w:val="yellow"/>
-        </w:rPr>
         <w:t xml:space="preserve"> (Technical Report CS-Sysplm-2-2018). Kennesaw State University.</w:t>
       </w:r>
-    </w:p>
-    <w:p>
-      <w:pPr>
-        <w:spacing w:after="160"/>
-      </w:pPr>
-      <w:r>
-        <w:rPr>
-          <w:highlight w:val="yellow"/>
-        </w:rPr>
-        <w:t xml:space="preserve">Sebesta, R. W. (2023). </w:t>
+      <w:r>
+        <w:br/>
+      </w:r>
+      <w:r>
+        <w:t xml:space="preserve">Python Software Foundation. (n.d.). </w:t>
       </w:r>
       <w:r>
         <w:rPr>
           <w:i/>
           <w:iCs/>
-          <w:highlight w:val="yellow"/>
+        </w:rPr>
+        <w:t>Python 3.1</w:t>
+      </w:r>
+      <w:r>
+        <w:rPr>
+          <w:i/>
+          <w:iCs/>
+        </w:rPr>
+        <w:t>4</w:t>
+      </w:r>
+      <w:r>
+        <w:rPr>
+          <w:i/>
+          <w:iCs/>
+        </w:rPr>
+        <w:t xml:space="preserve"> documentation</w:t>
+      </w:r>
+      <w:r>
+        <w:t xml:space="preserve">. </w:t>
+      </w:r>
+      <w:hyperlink r:id="rId10" w:history="1">
+        <w:r>
+          <w:rPr>
+            <w:rStyle w:val="Hyperlink"/>
+          </w:rPr>
+          <w:t>https://docs.python.org/3.</w:t>
+        </w:r>
+        <w:r>
+          <w:rPr>
+            <w:rStyle w:val="Hyperlink"/>
+          </w:rPr>
+          <w:t>14</w:t>
+        </w:r>
+        <w:r>
+          <w:rPr>
+            <w:rStyle w:val="Hyperlink"/>
+          </w:rPr>
+          <w:t>/</w:t>
+        </w:r>
+      </w:hyperlink>
+    </w:p>
+    <w:p>
+      <w:pPr>
+        <w:spacing w:after="160"/>
+      </w:pPr>
+      <w:r>
+        <w:t xml:space="preserve">Sebesta, R. W. (2023). </w:t>
+      </w:r>
+      <w:r>
+        <w:rPr>
+          <w:i/>
+          <w:iCs/>
         </w:rPr>
         <w:t>Concepts of programming languages</w:t>
       </w:r>
       <w:r>
-        <w:rPr>
-          <w:highlight w:val="yellow"/>
-        </w:rPr>
         <w:t>. Pearson Education Limited.</w:t>
-      </w:r>
-    </w:p>
-    <w:p>
-      <w:pPr>
-        <w:spacing w:after="160"/>
-      </w:pPr>
-      <w:r>
-        <w:rPr>
-          <w:highlight w:val="yellow"/>
-        </w:rPr>
-        <w:t>[TODO: add any other sources the team used]</w:t>
       </w:r>
     </w:p>
     <w:p>
@@ -46039,8 +46138,8 @@
       </w:r>
     </w:p>
     <w:sectPr>
-      <w:headerReference w:type="default" r:id="rId7"/>
-      <w:footerReference w:type="default" r:id="rId8"/>
+      <w:headerReference w:type="default" r:id="rId11"/>
+      <w:footerReference w:type="default" r:id="rId12"/>
       <w:pgSz w:w="12240" w:h="15840"/>
       <w:pgMar w:top="1440" w:right="1440" w:bottom="1440" w:left="1440" w:header="708" w:footer="708" w:gutter="0"/>
       <w:cols w:space="720"/>
@@ -46815,7 +46914,6 @@
   <w:style w:type="character" w:default="1" w:styleId="DefaultParagraphFont">
     <w:name w:val="Default Paragraph Font"/>
     <w:uiPriority w:val="1"/>
-    <w:semiHidden/>
     <w:unhideWhenUsed/>
   </w:style>
   <w:style w:type="table" w:default="1" w:styleId="TableNormal">
@@ -46935,6 +47033,49 @@
     <w:rPr>
       <w:sz w:val="20"/>
       <w:szCs w:val="20"/>
+    </w:rPr>
+  </w:style>
+  <w:style w:type="paragraph" w:styleId="Caption">
+    <w:name w:val="caption"/>
+    <w:basedOn w:val="Normal"/>
+    <w:next w:val="Normal"/>
+    <w:uiPriority w:val="35"/>
+    <w:unhideWhenUsed/>
+    <w:qFormat/>
+    <w:rsid w:val="00E93A33"/>
+    <w:pPr>
+      <w:spacing w:after="200" w:line="240" w:lineRule="auto"/>
+    </w:pPr>
+    <w:rPr>
+      <w:i/>
+      <w:iCs/>
+      <w:color w:val="0E2841" w:themeColor="text2"/>
+      <w:sz w:val="18"/>
+      <w:szCs w:val="18"/>
+    </w:rPr>
+  </w:style>
+  <w:style w:type="character" w:styleId="UnresolvedMention">
+    <w:name w:val="Unresolved Mention"/>
+    <w:basedOn w:val="DefaultParagraphFont"/>
+    <w:uiPriority w:val="99"/>
+    <w:semiHidden/>
+    <w:unhideWhenUsed/>
+    <w:rsid w:val="00F4685E"/>
+    <w:rPr>
+      <w:color w:val="605E5C"/>
+      <w:shd w:val="clear" w:color="auto" w:fill="E1DFDD"/>
+    </w:rPr>
+  </w:style>
+  <w:style w:type="character" w:styleId="FollowedHyperlink">
+    <w:name w:val="FollowedHyperlink"/>
+    <w:basedOn w:val="DefaultParagraphFont"/>
+    <w:uiPriority w:val="99"/>
+    <w:semiHidden/>
+    <w:unhideWhenUsed/>
+    <w:rsid w:val="0048768D"/>
+    <w:rPr>
+      <w:color w:val="96607D" w:themeColor="followedHyperlink"/>
+      <w:u w:val="single"/>
     </w:rPr>
   </w:style>
 </w:styles>

</xml_diff>